<commit_message>
Deploying to gh-pages from @ masdian/262701@4bc4b577aeb87386a7193caa4bd9722908c14b68 🚀
</commit_message>
<xml_diff>
--- a/Your-Book-Title.docx
+++ b/Your-Book-Title.docx
@@ -23,7 +23,7 @@
         <w:pStyle w:val="Date"/>
       </w:pPr>
       <w:r>
-        <w:t xml:space="preserve">Last updated: 2026-05-19</w:t>
+        <w:t xml:space="preserve">Last updated: 2026-05-31</w:t>
       </w:r>
     </w:p>
     <w:bookmarkStart w:id="15" w:name="welcome"/>
@@ -2265,7 +2265,7 @@
         <w:t xml:space="preserve"> </w:t>
       </w:r>
       <w:r>
-        <w:t xml:space="preserve">f7f86e1</w:t>
+        <w:t xml:space="preserve">4bc4b57</w:t>
       </w:r>
     </w:p>
     <w:p>
@@ -2287,7 +2287,7 @@
         <w:t xml:space="preserve"> </w:t>
       </w:r>
       <w:r>
-        <w:t xml:space="preserve">f7f86e111ee1fff58575a4236a35780237ea784c</w:t>
+        <w:t xml:space="preserve">4bc4b577aeb87386a7193caa4bd9722908c14b68</w:t>
       </w:r>
     </w:p>
     <w:p>
@@ -2309,7 +2309,7 @@
         <w:t xml:space="preserve"> </w:t>
       </w:r>
       <w:r>
-        <w:t xml:space="preserve">2026-05-18 18:22:21 -0700</w:t>
+        <w:t xml:space="preserve">2026-05-31 10:28:56 +0700</w:t>
       </w:r>
     </w:p>
     <w:p>

</xml_diff>